<commit_message>
Refactor RoadGP Sub-Page 2 users section to 3-column architecture and add persona assets
- Refactored Sub-Page 2 (Users, Journeys & Workflows) in roadgp-interface.html into a concise 3-column layout:
  - Column 1: Phase 1 Discovery with 4 conceptual personas in a 2x2 grid using the circular avatar component
  - Column 2: Research profile example for Stephen Darwin detailing needs, frustrations, and value propositions
  - Column 3: Narrowed Phase 2 MVP deployment personas (Asset Manager and Regional Service Provider) stacked vertically
- Updated stakeholder discovery callout note with concise interview insights from National Highways
- Added custom headshots and workflow diagram assets in images/RoadGP/Users/
- Updated style.css with .users-three-column-grid, .personas-2x2-grid, .personas-stacked-col, and purple persona variants
- Cleaned up navigation and temporary office document locks
</commit_message>
<xml_diff>
--- a/agents/prompts.docx
+++ b/agents/prompts.docx
@@ -314,12 +314,62 @@
       </w:r>
     </w:p>
     <w:p>
+      <w:pPr>
+        <w:rPr>
+          <w:b/>
+          <w:bCs/>
+        </w:rPr>
+      </w:pPr>
+      <w:r>
+        <w:rPr>
+          <w:b/>
+          <w:bCs/>
+        </w:rPr>
+        <w:t>/</w:t>
+      </w:r>
+      <w:proofErr w:type="gramStart"/>
+      <w:r>
+        <w:rPr>
+          <w:b/>
+          <w:bCs/>
+        </w:rPr>
+        <w:t>grill</w:t>
+      </w:r>
+      <w:proofErr w:type="gramEnd"/>
+      <w:r>
+        <w:rPr>
+          <w:b/>
+          <w:bCs/>
+        </w:rPr>
+        <w:t>-</w:t>
+      </w:r>
+      <w:proofErr w:type="gramStart"/>
+      <w:r>
+        <w:rPr>
+          <w:b/>
+          <w:bCs/>
+        </w:rPr>
+        <w:t>me  for</w:t>
+      </w:r>
+      <w:proofErr w:type="gramEnd"/>
+      <w:r>
+        <w:rPr>
+          <w:b/>
+          <w:bCs/>
+        </w:rPr>
+        <w:t xml:space="preserve"> additional questions if any</w:t>
+      </w:r>
+    </w:p>
+    <w:p>
       <w:proofErr w:type="spellStart"/>
       <w:r>
         <w:t>RoadGP</w:t>
       </w:r>
       <w:proofErr w:type="spellEnd"/>
       <w:r>
+        <w:t xml:space="preserve"> project page</w:t>
+      </w:r>
+      <w:r>
         <w:t xml:space="preserve"> is my current </w:t>
       </w:r>
       <w:proofErr w:type="gramStart"/>
@@ -328,16 +378,35 @@
       </w:r>
       <w:proofErr w:type="gramEnd"/>
       <w:r>
-        <w:t xml:space="preserve"> and it has 11 A4 landscape pages, which I want you to define by subtitle and green line underneath.</w:t>
-      </w:r>
-    </w:p>
-    <w:p>
-      <w:r>
-        <w:t>Page 1 Problems</w:t>
-      </w:r>
-    </w:p>
-    <w:p>
-      <w:r>
+        <w:t xml:space="preserve"> and it has 11 A4 landscape </w:t>
+      </w:r>
+      <w:r>
+        <w:t xml:space="preserve">sub- </w:t>
+      </w:r>
+      <w:r>
+        <w:t xml:space="preserve">pages, which I want you to </w:t>
+      </w:r>
+      <w:r>
+        <w:t>separate</w:t>
+      </w:r>
+      <w:r>
+        <w:t xml:space="preserve"> by subtitle and green line underneath.</w:t>
+      </w:r>
+      <w:r>
+        <w:t xml:space="preserve"> This page should open from featured index.htm and projects.html</w:t>
+      </w:r>
+    </w:p>
+    <w:p>
+      <w:r>
+        <w:t>Sub-p</w:t>
+      </w:r>
+      <w:r>
+        <w:t>age 1 Problems</w:t>
+      </w:r>
+    </w:p>
+    <w:p>
+      <w:r>
+        <w:lastRenderedPageBreak/>
         <w:t>Agents/</w:t>
       </w:r>
       <w:proofErr w:type="spellStart"/>
@@ -354,11 +423,7 @@
       </w:r>
       <w:proofErr w:type="gramEnd"/>
       <w:r>
-        <w:t xml:space="preserve"> persona use a picture headshot in circle with 2-3pt stroke and have a person name underneath. Use it for my team </w:t>
-      </w:r>
-      <w:r>
-        <w:lastRenderedPageBreak/>
-        <w:t xml:space="preserve">members and user personas. In the folder: </w:t>
+        <w:t xml:space="preserve"> persona use a picture headshot in circle with 2-3pt stroke and have a person name underneath. Use it for my team members and user personas. In the folder: </w:t>
       </w:r>
       <w:r>
         <w:t>C:\Users\Admin\Documents\GitHub\liliapotseluyko.github.io\images\RoadGP\Problems</w:t>
@@ -523,6 +588,7 @@
         </w:rPr>
       </w:pPr>
       <w:r>
+        <w:lastRenderedPageBreak/>
         <w:t>Some problems are related to my colleague work as shown in smart materials and Robotic Crack Sealing</w:t>
       </w:r>
       <w:r>
@@ -532,7 +598,6 @@
         <w:br/>
       </w:r>
       <w:r>
-        <w:lastRenderedPageBreak/>
         <w:t xml:space="preserve">Break this text below into </w:t>
       </w:r>
       <w:proofErr w:type="spellStart"/>
@@ -740,8 +805,69 @@
         </w:numPr>
       </w:pPr>
       <w:r>
+        <w:lastRenderedPageBreak/>
         <w:t>A pathway to future connected delivery methods, including robotic repair and smart self-sealing materials.</w:t>
       </w:r>
+    </w:p>
+    <w:p>
+      <w:pPr>
+        <w:ind w:left="360"/>
+      </w:pPr>
+    </w:p>
+    <w:p>
+      <w:pPr>
+        <w:ind w:left="360"/>
+      </w:pPr>
+      <w:r>
+        <w:t>Use folder images/</w:t>
+      </w:r>
+      <w:proofErr w:type="spellStart"/>
+      <w:r>
+        <w:t>RoadGP</w:t>
+      </w:r>
+      <w:proofErr w:type="spellEnd"/>
+      <w:r>
+        <w:t>/Users to create SUB-PAGE -2 Users.</w:t>
+      </w:r>
+      <w:r>
+        <w:t xml:space="preserve"> Use image names for directions when specified names are used</w:t>
+      </w:r>
+      <w:r>
+        <w:t xml:space="preserve">. This </w:t>
+      </w:r>
+      <w:proofErr w:type="spellStart"/>
+      <w:r>
+        <w:t xml:space="preserve">sub </w:t>
+      </w:r>
+      <w:r>
+        <w:t>page</w:t>
+      </w:r>
+      <w:proofErr w:type="spellEnd"/>
+      <w:r>
+        <w:t xml:space="preserve"> should have a cohesive look. Workflow images would be used in a small size to show volume of work. But be precise, do not hallucinate, be precise with text, but be creative with how you organize images and text on the page. I do not need to put all the images because it's a product or UX case study. I just need to demonstrate a few cohesive images. I want to put a note that I've interviewed staff at National Highways to generate user personas. I am start</w:t>
+      </w:r>
+      <w:r>
+        <w:t>ed</w:t>
+      </w:r>
+      <w:r>
+        <w:t xml:space="preserve"> from conceptual version</w:t>
+      </w:r>
+      <w:r>
+        <w:t xml:space="preserve"> of </w:t>
+      </w:r>
+      <w:proofErr w:type="spellStart"/>
+      <w:r>
+        <w:t>useres</w:t>
+      </w:r>
+      <w:proofErr w:type="spellEnd"/>
+      <w:r>
+        <w:t xml:space="preserve"> and getting closer to deployment stage using much more narrow user personas, only asset manager and the service provider, to narrow down the scope for MVP.</w:t>
+      </w:r>
+    </w:p>
+    <w:p>
+      <w:pPr>
+        <w:ind w:left="360"/>
+      </w:pPr>
     </w:p>
     <w:p>
       <w:r>

</xml_diff>